<commit_message>
docs: rewrite LMS submission description in first person, tighten layout
Same verified figures, clearer prose: the description now states the
prediction point, leakage controls, population rule, split and metric
choice directly, and the file fits one page.

Co-Authored-By: Claude Fable 5 <noreply@anthropic.com>
Claude-Session: https://claude.ai/code/session_0123bLSmbWi4mi2LvVtD5wdh
</commit_message>
<xml_diff>
--- a/submission/submission_details.docx
+++ b/submission/submission_details.docx
@@ -19,7 +19,7 @@
     </w:p>
     <w:p>
       <w:pPr>
-        <w:spacing w:after="360"/>
+        <w:spacing w:after="340"/>
         <w:jc w:val="center"/>
       </w:pPr>
       <w:r>
@@ -28,7 +28,7 @@
           <w:sz w:val="24"/>
           <w:szCs w:val="24"/>
         </w:rPr>
-        <w:t xml:space="preserve">AI/ML Fundamentals Course — Module 8</w:t>
+        <w:t xml:space="preserve">AI/ML Fundamentals Course, Module 8</w:t>
       </w:r>
     </w:p>
     <w:tbl>
@@ -59,10 +59,10 @@
             </w:tcBorders>
             <w:shd w:fill="F2F2F2" w:val="clear"/>
             <w:tcMar>
-              <w:top w:type="dxa" w:w="120"/>
-              <w:left w:type="dxa" w:w="160"/>
-              <w:bottom w:type="dxa" w:w="120"/>
-              <w:right w:type="dxa" w:w="160"/>
+              <w:top w:type="dxa" w:w="130"/>
+              <w:left w:type="dxa" w:w="170"/>
+              <w:bottom w:type="dxa" w:w="130"/>
+              <w:right w:type="dxa" w:w="170"/>
             </w:tcMar>
           </w:tcPr>
           <w:p>
@@ -87,278 +87,12 @@
               <w:right w:val="single" w:color="BFBFBF" w:sz="4"/>
             </w:tcBorders>
             <w:tcMar>
-              <w:top w:type="dxa" w:w="120"/>
-              <w:left w:type="dxa" w:w="160"/>
-              <w:bottom w:type="dxa" w:w="120"/>
-              <w:right w:type="dxa" w:w="160"/>
-            </w:tcMar>
-          </w:tcPr>
-          <w:p>
-            <w:pPr>
-              <w:spacing w:after="80"/>
-            </w:pPr>
-            <w:r>
-              <w:rPr>
-                <w:sz w:val="22"/>
-                <w:szCs w:val="22"/>
-              </w:rPr>
-              <w:t xml:space="preserve">Mubinabegim To'lqinjonova</w:t>
-            </w:r>
-          </w:p>
-        </w:tc>
-      </w:tr>
-      <w:tr>
-        <w:tc>
-          <w:tcPr>
-            <w:tcW w:type="dxa" w:w="2900"/>
-            <w:tcBorders>
-              <w:top w:val="single" w:color="BFBFBF" w:sz="4"/>
-              <w:left w:val="single" w:color="BFBFBF" w:sz="4"/>
-              <w:bottom w:val="single" w:color="BFBFBF" w:sz="4"/>
-              <w:right w:val="single" w:color="BFBFBF" w:sz="4"/>
-            </w:tcBorders>
-            <w:shd w:fill="F2F2F2" w:val="clear"/>
-            <w:tcMar>
-              <w:top w:type="dxa" w:w="120"/>
-              <w:left w:type="dxa" w:w="160"/>
-              <w:bottom w:type="dxa" w:w="120"/>
-              <w:right w:type="dxa" w:w="160"/>
-            </w:tcMar>
-          </w:tcPr>
-          <w:p>
-            <w:r>
-              <w:rPr>
-                <w:b/>
-                <w:bCs/>
-                <w:sz w:val="22"/>
-                <w:szCs w:val="22"/>
-              </w:rPr>
-              <w:t xml:space="preserve">Project Track</w:t>
-            </w:r>
-          </w:p>
-        </w:tc>
-        <w:tc>
-          <w:tcPr>
-            <w:tcW w:type="dxa" w:w="6460"/>
-            <w:tcBorders>
-              <w:top w:val="single" w:color="BFBFBF" w:sz="4"/>
-              <w:left w:val="single" w:color="BFBFBF" w:sz="4"/>
-              <w:bottom w:val="single" w:color="BFBFBF" w:sz="4"/>
-              <w:right w:val="single" w:color="BFBFBF" w:sz="4"/>
-            </w:tcBorders>
-            <w:tcMar>
-              <w:top w:type="dxa" w:w="120"/>
-              <w:left w:type="dxa" w:w="160"/>
-              <w:bottom w:type="dxa" w:w="120"/>
-              <w:right w:type="dxa" w:w="160"/>
-            </w:tcMar>
-          </w:tcPr>
-          <w:p>
-            <w:pPr>
-              <w:spacing w:after="80"/>
-            </w:pPr>
-            <w:r>
-              <w:rPr>
-                <w:sz w:val="22"/>
-                <w:szCs w:val="22"/>
-              </w:rPr>
-              <w:t xml:space="preserve">Field-Based Scenario Track — EDU-02: Student Performance Early-Warning Model (EdTech)</w:t>
-            </w:r>
-          </w:p>
-        </w:tc>
-      </w:tr>
-      <w:tr>
-        <w:tc>
-          <w:tcPr>
-            <w:tcW w:type="dxa" w:w="2900"/>
-            <w:tcBorders>
-              <w:top w:val="single" w:color="BFBFBF" w:sz="4"/>
-              <w:left w:val="single" w:color="BFBFBF" w:sz="4"/>
-              <w:bottom w:val="single" w:color="BFBFBF" w:sz="4"/>
-              <w:right w:val="single" w:color="BFBFBF" w:sz="4"/>
-            </w:tcBorders>
-            <w:shd w:fill="F2F2F2" w:val="clear"/>
-            <w:tcMar>
-              <w:top w:type="dxa" w:w="120"/>
-              <w:left w:type="dxa" w:w="160"/>
-              <w:bottom w:type="dxa" w:w="120"/>
-              <w:right w:type="dxa" w:w="160"/>
-            </w:tcMar>
-          </w:tcPr>
-          <w:p>
-            <w:r>
-              <w:rPr>
-                <w:b/>
-                <w:bCs/>
-                <w:sz w:val="22"/>
-                <w:szCs w:val="22"/>
-              </w:rPr>
-              <w:t xml:space="preserve">Project Title</w:t>
-            </w:r>
-          </w:p>
-        </w:tc>
-        <w:tc>
-          <w:tcPr>
-            <w:tcW w:type="dxa" w:w="6460"/>
-            <w:tcBorders>
-              <w:top w:val="single" w:color="BFBFBF" w:sz="4"/>
-              <w:left w:val="single" w:color="BFBFBF" w:sz="4"/>
-              <w:bottom w:val="single" w:color="BFBFBF" w:sz="4"/>
-              <w:right w:val="single" w:color="BFBFBF" w:sz="4"/>
-            </w:tcBorders>
-            <w:tcMar>
-              <w:top w:type="dxa" w:w="120"/>
-              <w:left w:type="dxa" w:w="160"/>
-              <w:bottom w:type="dxa" w:w="120"/>
-              <w:right w:type="dxa" w:w="160"/>
-            </w:tcMar>
-          </w:tcPr>
-          <w:p>
-            <w:pPr>
-              <w:spacing w:after="80"/>
-            </w:pPr>
-            <w:r>
-              <w:rPr>
-                <w:sz w:val="22"/>
-                <w:szCs w:val="22"/>
-              </w:rPr>
-              <w:t xml:space="preserve">Student Performance Early-Warning Model — predicting academic risk from early-course data (OULAD)</w:t>
-            </w:r>
-          </w:p>
-        </w:tc>
-      </w:tr>
-      <w:tr>
-        <w:tc>
-          <w:tcPr>
-            <w:tcW w:type="dxa" w:w="2900"/>
-            <w:tcBorders>
-              <w:top w:val="single" w:color="BFBFBF" w:sz="4"/>
-              <w:left w:val="single" w:color="BFBFBF" w:sz="4"/>
-              <w:bottom w:val="single" w:color="BFBFBF" w:sz="4"/>
-              <w:right w:val="single" w:color="BFBFBF" w:sz="4"/>
-            </w:tcBorders>
-            <w:shd w:fill="F2F2F2" w:val="clear"/>
-            <w:tcMar>
-              <w:top w:type="dxa" w:w="120"/>
-              <w:left w:type="dxa" w:w="160"/>
-              <w:bottom w:type="dxa" w:w="120"/>
-              <w:right w:type="dxa" w:w="160"/>
-            </w:tcMar>
-          </w:tcPr>
-          <w:p>
-            <w:r>
-              <w:rPr>
-                <w:b/>
-                <w:bCs/>
-                <w:sz w:val="22"/>
-                <w:szCs w:val="22"/>
-              </w:rPr>
-              <w:t xml:space="preserve">Repository URL</w:t>
-            </w:r>
-          </w:p>
-        </w:tc>
-        <w:tc>
-          <w:tcPr>
-            <w:tcW w:type="dxa" w:w="6460"/>
-            <w:tcBorders>
-              <w:top w:val="single" w:color="BFBFBF" w:sz="4"/>
-              <w:left w:val="single" w:color="BFBFBF" w:sz="4"/>
-              <w:bottom w:val="single" w:color="BFBFBF" w:sz="4"/>
-              <w:right w:val="single" w:color="BFBFBF" w:sz="4"/>
-            </w:tcBorders>
-            <w:tcMar>
-              <w:top w:type="dxa" w:w="120"/>
-              <w:left w:type="dxa" w:w="160"/>
-              <w:bottom w:type="dxa" w:w="120"/>
-              <w:right w:type="dxa" w:w="160"/>
-            </w:tcMar>
-          </w:tcPr>
-          <w:p>
-            <w:pPr>
-              <w:spacing w:after="80"/>
-            </w:pPr>
-            <w:r>
-              <w:rPr>
-                <w:color w:val="1155CC"/>
-                <w:sz w:val="22"/>
-                <w:szCs w:val="22"/>
-                <w:u w:val="single"/>
-              </w:rPr>
-              <w:t xml:space="preserve">https://github.com/Mubina-lazy/edu02-early-warning-model</w:t>
-            </w:r>
-          </w:p>
-        </w:tc>
-      </w:tr>
-      <w:tr>
-        <w:tc>
-          <w:tcPr>
-            <w:tcW w:type="dxa" w:w="2900"/>
-            <w:tcBorders>
-              <w:top w:val="single" w:color="BFBFBF" w:sz="4"/>
-              <w:left w:val="single" w:color="BFBFBF" w:sz="4"/>
-              <w:bottom w:val="single" w:color="BFBFBF" w:sz="4"/>
-              <w:right w:val="single" w:color="BFBFBF" w:sz="4"/>
-            </w:tcBorders>
-            <w:shd w:fill="F2F2F2" w:val="clear"/>
-            <w:tcMar>
-              <w:top w:type="dxa" w:w="120"/>
-              <w:left w:type="dxa" w:w="160"/>
-              <w:bottom w:type="dxa" w:w="120"/>
-              <w:right w:type="dxa" w:w="160"/>
-            </w:tcMar>
-          </w:tcPr>
-          <w:p>
-            <w:r>
-              <w:rPr>
-                <w:b/>
-                <w:bCs/>
-                <w:sz w:val="22"/>
-                <w:szCs w:val="22"/>
-              </w:rPr>
-              <w:t xml:space="preserve">Short Project Description</w:t>
-            </w:r>
-          </w:p>
-        </w:tc>
-        <w:tc>
-          <w:tcPr>
-            <w:tcW w:type="dxa" w:w="6460"/>
-            <w:tcBorders>
-              <w:top w:val="single" w:color="BFBFBF" w:sz="4"/>
-              <w:left w:val="single" w:color="BFBFBF" w:sz="4"/>
-              <w:bottom w:val="single" w:color="BFBFBF" w:sz="4"/>
-              <w:right w:val="single" w:color="BFBFBF" w:sz="4"/>
-            </w:tcBorders>
-            <w:tcMar>
-              <w:top w:type="dxa" w:w="120"/>
-              <w:left w:type="dxa" w:w="160"/>
-              <w:bottom w:type="dxa" w:w="120"/>
-              <w:right w:type="dxa" w:w="160"/>
-            </w:tcMar>
-          </w:tcPr>
-          <w:p>
-            <w:pPr>
-              <w:spacing w:after="80"/>
-            </w:pPr>
-            <w:r>
-              <w:rPr>
-                <w:sz w:val="22"/>
-                <w:szCs w:val="22"/>
-              </w:rPr>
-              <w:t xml:space="preserve">A binary classification system that flags students at risk of failing or withdrawing from an online course, using only information available in the first ~25% of the course: demographics, virtual learning environment (VLE) click activity, and already-due early assignment scores. Built on the Open University Learning Analytics Dataset (OULAD, CC-BY 4.0; 32,593 students, 22 course presentations).</w:t>
-            </w:r>
-          </w:p>
-          <w:p>
-            <w:pPr>
-              <w:spacing w:after="80"/>
-            </w:pPr>
-            <w:r>
-              <w:rPr>
-                <w:sz w:val="22"/>
-                <w:szCs w:val="22"/>
-              </w:rPr>
-              <w:t xml:space="preserve">The data pipeline is leakage-safe by construction: a documented data audit with an issue log, a chronological split by course presentation (train on 2013 cohorts, validate on 2014B, test once on the unseen 2014J cohort), and explicit bans on any post-cutoff information. Seven experiment runs (DummyClassifier and Logistic Regression baselines, weighted Logistic Regression, two Random Forests, two XGBoost variants) were tracked in MLflow; the final model is XGBoost with a decision threshold of 0.327 tuned on validation.</w:t>
-            </w:r>
-          </w:p>
+              <w:top w:type="dxa" w:w="130"/>
+              <w:left w:type="dxa" w:w="170"/>
+              <w:bottom w:type="dxa" w:w="130"/>
+              <w:right w:type="dxa" w:w="170"/>
+            </w:tcMar>
+          </w:tcPr>
           <w:p>
             <w:pPr>
               <w:spacing w:after="0"/>
@@ -368,7 +102,7 @@
                 <w:sz w:val="22"/>
                 <w:szCs w:val="22"/>
               </w:rPr>
-              <w:t xml:space="preserve">Final one-shot test results (2014J): recall 0.760 / precision 0.583 / F1 0.660 / PR-AUC 0.714 for the at-risk class, versus zero recall for the majority baseline. The report includes per-module results (including a documented cold-start course), fairness slices (no recall gap for students with disabilities), and a false-negative error analysis. The repository is fully reproducible from raw data with pinned dependencies.</w:t>
+              <w:t xml:space="preserve">Mubinabegim To'lqinjonova</w:t>
             </w:r>
           </w:p>
         </w:tc>
@@ -385,10 +119,10 @@
             </w:tcBorders>
             <w:shd w:fill="F2F2F2" w:val="clear"/>
             <w:tcMar>
-              <w:top w:type="dxa" w:w="120"/>
-              <w:left w:type="dxa" w:w="160"/>
-              <w:bottom w:type="dxa" w:w="120"/>
-              <w:right w:type="dxa" w:w="160"/>
+              <w:top w:type="dxa" w:w="130"/>
+              <w:left w:type="dxa" w:w="170"/>
+              <w:bottom w:type="dxa" w:w="130"/>
+              <w:right w:type="dxa" w:w="170"/>
             </w:tcMar>
           </w:tcPr>
           <w:p>
@@ -399,7 +133,7 @@
                 <w:sz w:val="22"/>
                 <w:szCs w:val="22"/>
               </w:rPr>
-              <w:t xml:space="preserve">Demo / Application Link</w:t>
+              <w:t xml:space="preserve">Project Track</w:t>
             </w:r>
           </w:p>
         </w:tc>
@@ -413,10 +147,10 @@
               <w:right w:val="single" w:color="BFBFBF" w:sz="4"/>
             </w:tcBorders>
             <w:tcMar>
-              <w:top w:type="dxa" w:w="120"/>
-              <w:left w:type="dxa" w:w="160"/>
-              <w:bottom w:type="dxa" w:w="120"/>
-              <w:right w:type="dxa" w:w="160"/>
+              <w:top w:type="dxa" w:w="130"/>
+              <w:left w:type="dxa" w:w="170"/>
+              <w:bottom w:type="dxa" w:w="130"/>
+              <w:right w:type="dxa" w:w="170"/>
             </w:tcMar>
           </w:tcPr>
           <w:p>
@@ -428,7 +162,7 @@
                 <w:sz w:val="22"/>
                 <w:szCs w:val="22"/>
               </w:rPr>
-              <w:t xml:space="preserve">Reproducible Google Colab demo: demo.ipynb in the repository root (open in Colab and Run all; no dataset download required — the trained model artifact ships with the repository).</w:t>
+              <w:t xml:space="preserve">Field-Based Scenario Track. EDU-02: Student Performance Early-Warning Model (EdTech)</w:t>
             </w:r>
           </w:p>
         </w:tc>
@@ -445,10 +179,10 @@
             </w:tcBorders>
             <w:shd w:fill="F2F2F2" w:val="clear"/>
             <w:tcMar>
-              <w:top w:type="dxa" w:w="120"/>
-              <w:left w:type="dxa" w:w="160"/>
-              <w:bottom w:type="dxa" w:w="120"/>
-              <w:right w:type="dxa" w:w="160"/>
+              <w:top w:type="dxa" w:w="130"/>
+              <w:left w:type="dxa" w:w="170"/>
+              <w:bottom w:type="dxa" w:w="130"/>
+              <w:right w:type="dxa" w:w="170"/>
             </w:tcMar>
           </w:tcPr>
           <w:p>
@@ -459,7 +193,7 @@
                 <w:sz w:val="22"/>
                 <w:szCs w:val="22"/>
               </w:rPr>
-              <w:t xml:space="preserve">Access Instructions</w:t>
+              <w:t xml:space="preserve">Project Title</w:t>
             </w:r>
           </w:p>
         </w:tc>
@@ -473,10 +207,10 @@
               <w:right w:val="single" w:color="BFBFBF" w:sz="4"/>
             </w:tcBorders>
             <w:tcMar>
-              <w:top w:type="dxa" w:w="120"/>
-              <w:left w:type="dxa" w:w="160"/>
-              <w:bottom w:type="dxa" w:w="120"/>
-              <w:right w:type="dxa" w:w="160"/>
+              <w:top w:type="dxa" w:w="130"/>
+              <w:left w:type="dxa" w:w="170"/>
+              <w:bottom w:type="dxa" w:w="130"/>
+              <w:right w:type="dxa" w:w="170"/>
             </w:tcMar>
           </w:tcPr>
           <w:p>
@@ -488,7 +222,273 @@
                 <w:sz w:val="22"/>
                 <w:szCs w:val="22"/>
               </w:rPr>
-              <w:t xml:space="preserve">The repository is public — no special access is required. All code, evaluation reports, the trained model artifact, and the Colab demo are available directly from the link above.</w:t>
+              <w:t xml:space="preserve">Student Performance Early-Warning Model: predicting academic risk from early-course data (OULAD)</w:t>
+            </w:r>
+          </w:p>
+        </w:tc>
+      </w:tr>
+      <w:tr>
+        <w:tc>
+          <w:tcPr>
+            <w:tcW w:type="dxa" w:w="2900"/>
+            <w:tcBorders>
+              <w:top w:val="single" w:color="BFBFBF" w:sz="4"/>
+              <w:left w:val="single" w:color="BFBFBF" w:sz="4"/>
+              <w:bottom w:val="single" w:color="BFBFBF" w:sz="4"/>
+              <w:right w:val="single" w:color="BFBFBF" w:sz="4"/>
+            </w:tcBorders>
+            <w:shd w:fill="F2F2F2" w:val="clear"/>
+            <w:tcMar>
+              <w:top w:type="dxa" w:w="130"/>
+              <w:left w:type="dxa" w:w="170"/>
+              <w:bottom w:type="dxa" w:w="130"/>
+              <w:right w:type="dxa" w:w="170"/>
+            </w:tcMar>
+          </w:tcPr>
+          <w:p>
+            <w:r>
+              <w:rPr>
+                <w:b/>
+                <w:bCs/>
+                <w:sz w:val="22"/>
+                <w:szCs w:val="22"/>
+              </w:rPr>
+              <w:t xml:space="preserve">Repository URL</w:t>
+            </w:r>
+          </w:p>
+        </w:tc>
+        <w:tc>
+          <w:tcPr>
+            <w:tcW w:type="dxa" w:w="6460"/>
+            <w:tcBorders>
+              <w:top w:val="single" w:color="BFBFBF" w:sz="4"/>
+              <w:left w:val="single" w:color="BFBFBF" w:sz="4"/>
+              <w:bottom w:val="single" w:color="BFBFBF" w:sz="4"/>
+              <w:right w:val="single" w:color="BFBFBF" w:sz="4"/>
+            </w:tcBorders>
+            <w:tcMar>
+              <w:top w:type="dxa" w:w="130"/>
+              <w:left w:type="dxa" w:w="170"/>
+              <w:bottom w:type="dxa" w:w="130"/>
+              <w:right w:type="dxa" w:w="170"/>
+            </w:tcMar>
+          </w:tcPr>
+          <w:p>
+            <w:pPr>
+              <w:spacing w:after="0"/>
+            </w:pPr>
+            <w:r>
+              <w:rPr>
+                <w:color w:val="1155CC"/>
+                <w:sz w:val="22"/>
+                <w:szCs w:val="22"/>
+                <w:u w:val="single"/>
+              </w:rPr>
+              <w:t xml:space="preserve">https://github.com/Mubina-lazy/edu02-early-warning-model</w:t>
+            </w:r>
+          </w:p>
+        </w:tc>
+      </w:tr>
+      <w:tr>
+        <w:tc>
+          <w:tcPr>
+            <w:tcW w:type="dxa" w:w="2900"/>
+            <w:tcBorders>
+              <w:top w:val="single" w:color="BFBFBF" w:sz="4"/>
+              <w:left w:val="single" w:color="BFBFBF" w:sz="4"/>
+              <w:bottom w:val="single" w:color="BFBFBF" w:sz="4"/>
+              <w:right w:val="single" w:color="BFBFBF" w:sz="4"/>
+            </w:tcBorders>
+            <w:shd w:fill="F2F2F2" w:val="clear"/>
+            <w:tcMar>
+              <w:top w:type="dxa" w:w="130"/>
+              <w:left w:type="dxa" w:w="170"/>
+              <w:bottom w:type="dxa" w:w="130"/>
+              <w:right w:type="dxa" w:w="170"/>
+            </w:tcMar>
+          </w:tcPr>
+          <w:p>
+            <w:r>
+              <w:rPr>
+                <w:b/>
+                <w:bCs/>
+                <w:sz w:val="22"/>
+                <w:szCs w:val="22"/>
+              </w:rPr>
+              <w:t xml:space="preserve">Short Project Description</w:t>
+            </w:r>
+          </w:p>
+        </w:tc>
+        <w:tc>
+          <w:tcPr>
+            <w:tcW w:type="dxa" w:w="6460"/>
+            <w:tcBorders>
+              <w:top w:val="single" w:color="BFBFBF" w:sz="4"/>
+              <w:left w:val="single" w:color="BFBFBF" w:sz="4"/>
+              <w:bottom w:val="single" w:color="BFBFBF" w:sz="4"/>
+              <w:right w:val="single" w:color="BFBFBF" w:sz="4"/>
+            </w:tcBorders>
+            <w:tcMar>
+              <w:top w:type="dxa" w:w="130"/>
+              <w:left w:type="dxa" w:w="170"/>
+              <w:bottom w:type="dxa" w:w="130"/>
+              <w:right w:type="dxa" w:w="170"/>
+            </w:tcMar>
+          </w:tcPr>
+          <w:p>
+            <w:pPr>
+              <w:spacing w:after="140"/>
+            </w:pPr>
+            <w:r>
+              <w:rPr>
+                <w:sz w:val="22"/>
+                <w:szCs w:val="22"/>
+              </w:rPr>
+              <w:t xml:space="preserve">This project is an early-warning classifier for online courses. After roughly the first 25 percent of a course has elapsed, it estimates whether a student is at risk of failing or withdrawing, so that academic advisors can intervene while there is still time to help. The model uses only information available at that point: demographics, virtual learning environment (VLE) click activity, and scores from assignments that were already due. I built it on the Open University Learning Analytics Dataset (OULAD, CC-BY 4.0), which covers 32,593 student enrolments across 22 course presentations.</w:t>
+            </w:r>
+          </w:p>
+          <w:p>
+            <w:pPr>
+              <w:spacing w:after="140"/>
+            </w:pPr>
+            <w:r>
+              <w:rPr>
+                <w:sz w:val="22"/>
+                <w:szCs w:val="22"/>
+              </w:rPr>
+              <w:t xml:space="preserve">Preventing data leakage was the central design constraint. I completed a documented data audit with an issue log, fixed the prediction point at 25 percent of each course presentation's length, and excluded every feature dated after that point, including final exam results, later assignment scores and whole-course activity totals. I also excluded students who had already unregistered by the cutoff, because their outcome is known at prediction time and keeping them would inflate the results. The data is split chronologically by course presentation: I train on the 2013 cohorts, validate on 2014B, and evaluate once on the unseen 2014J cohort.</w:t>
+            </w:r>
+          </w:p>
+          <w:p>
+            <w:pPr>
+              <w:spacing w:after="0"/>
+            </w:pPr>
+            <w:r>
+              <w:rPr>
+                <w:sz w:val="22"/>
+                <w:szCs w:val="22"/>
+              </w:rPr>
+              <w:t xml:space="preserve">I compared seven runs in MLflow: a majority-class baseline, logistic regression with and without class weighting, two random forest configurations and two XGBoost configurations, tuning the decision threshold for each. The final model is XGBoost at a threshold of 0.327, selected on validation. On the held-out 2014J cohort it reaches recall 0.760, precision 0.583, F1 0.660 and PR-AUC 0.714 for the at-risk class, against 0.000 recall for the majority baseline. Because missing a struggling student costs more than an unnecessary check-in, recall and F1 are my primary metrics rather than accuracy. The evaluation report also covers per-module results (including one course with no training data), fairness slices by disability, socio-economic band, gender and age, and an analysis of the at-risk students the model fails to catch.</w:t>
+            </w:r>
+          </w:p>
+        </w:tc>
+      </w:tr>
+      <w:tr>
+        <w:tc>
+          <w:tcPr>
+            <w:tcW w:type="dxa" w:w="2900"/>
+            <w:tcBorders>
+              <w:top w:val="single" w:color="BFBFBF" w:sz="4"/>
+              <w:left w:val="single" w:color="BFBFBF" w:sz="4"/>
+              <w:bottom w:val="single" w:color="BFBFBF" w:sz="4"/>
+              <w:right w:val="single" w:color="BFBFBF" w:sz="4"/>
+            </w:tcBorders>
+            <w:shd w:fill="F2F2F2" w:val="clear"/>
+            <w:tcMar>
+              <w:top w:type="dxa" w:w="130"/>
+              <w:left w:type="dxa" w:w="170"/>
+              <w:bottom w:type="dxa" w:w="130"/>
+              <w:right w:type="dxa" w:w="170"/>
+            </w:tcMar>
+          </w:tcPr>
+          <w:p>
+            <w:r>
+              <w:rPr>
+                <w:b/>
+                <w:bCs/>
+                <w:sz w:val="22"/>
+                <w:szCs w:val="22"/>
+              </w:rPr>
+              <w:t xml:space="preserve">Demo / Application Link</w:t>
+            </w:r>
+          </w:p>
+        </w:tc>
+        <w:tc>
+          <w:tcPr>
+            <w:tcW w:type="dxa" w:w="6460"/>
+            <w:tcBorders>
+              <w:top w:val="single" w:color="BFBFBF" w:sz="4"/>
+              <w:left w:val="single" w:color="BFBFBF" w:sz="4"/>
+              <w:bottom w:val="single" w:color="BFBFBF" w:sz="4"/>
+              <w:right w:val="single" w:color="BFBFBF" w:sz="4"/>
+            </w:tcBorders>
+            <w:tcMar>
+              <w:top w:type="dxa" w:w="130"/>
+              <w:left w:type="dxa" w:w="170"/>
+              <w:bottom w:type="dxa" w:w="130"/>
+              <w:right w:type="dxa" w:w="170"/>
+            </w:tcMar>
+          </w:tcPr>
+          <w:p>
+            <w:pPr>
+              <w:spacing w:after="0"/>
+            </w:pPr>
+            <w:r>
+              <w:rPr>
+                <w:sz w:val="22"/>
+                <w:szCs w:val="22"/>
+              </w:rPr>
+              <w:t xml:space="preserve">Reproducible Google Colab demo: demo.ipynb in the repository root. Open it in Colab and run all cells. No dataset download is required, because the trained model artifact (under 1 MB) is committed to the repository. The notebook runs two real unseen students, shows how invalid input is rejected, and covers a zero-activity edge case.</w:t>
+            </w:r>
+          </w:p>
+        </w:tc>
+      </w:tr>
+      <w:tr>
+        <w:tc>
+          <w:tcPr>
+            <w:tcW w:type="dxa" w:w="2900"/>
+            <w:tcBorders>
+              <w:top w:val="single" w:color="BFBFBF" w:sz="4"/>
+              <w:left w:val="single" w:color="BFBFBF" w:sz="4"/>
+              <w:bottom w:val="single" w:color="BFBFBF" w:sz="4"/>
+              <w:right w:val="single" w:color="BFBFBF" w:sz="4"/>
+            </w:tcBorders>
+            <w:shd w:fill="F2F2F2" w:val="clear"/>
+            <w:tcMar>
+              <w:top w:type="dxa" w:w="130"/>
+              <w:left w:type="dxa" w:w="170"/>
+              <w:bottom w:type="dxa" w:w="130"/>
+              <w:right w:type="dxa" w:w="170"/>
+            </w:tcMar>
+          </w:tcPr>
+          <w:p>
+            <w:r>
+              <w:rPr>
+                <w:b/>
+                <w:bCs/>
+                <w:sz w:val="22"/>
+                <w:szCs w:val="22"/>
+              </w:rPr>
+              <w:t xml:space="preserve">Access Instructions</w:t>
+            </w:r>
+          </w:p>
+        </w:tc>
+        <w:tc>
+          <w:tcPr>
+            <w:tcW w:type="dxa" w:w="6460"/>
+            <w:tcBorders>
+              <w:top w:val="single" w:color="BFBFBF" w:sz="4"/>
+              <w:left w:val="single" w:color="BFBFBF" w:sz="4"/>
+              <w:bottom w:val="single" w:color="BFBFBF" w:sz="4"/>
+              <w:right w:val="single" w:color="BFBFBF" w:sz="4"/>
+            </w:tcBorders>
+            <w:tcMar>
+              <w:top w:type="dxa" w:w="130"/>
+              <w:left w:type="dxa" w:w="170"/>
+              <w:bottom w:type="dxa" w:w="130"/>
+              <w:right w:type="dxa" w:w="170"/>
+            </w:tcMar>
+          </w:tcPr>
+          <w:p>
+            <w:pPr>
+              <w:spacing w:after="0"/>
+            </w:pPr>
+            <w:r>
+              <w:rPr>
+                <w:sz w:val="22"/>
+                <w:szCs w:val="22"/>
+              </w:rPr>
+              <w:t xml:space="preserve">The repository is public, so no special access is required. All code, evaluation reports, the trained model artifact and the Colab demo are available directly from the link above.</w:t>
             </w:r>
           </w:p>
         </w:tc>
@@ -496,7 +496,7 @@
     </w:tbl>
     <w:p>
       <w:pPr>
-        <w:spacing w:after="0" w:before="360"/>
+        <w:spacing w:after="0" w:before="340"/>
       </w:pPr>
       <w:r>
         <w:rPr>
@@ -506,7 +506,7 @@
           <w:sz w:val="20"/>
           <w:szCs w:val="20"/>
         </w:rPr>
-        <w:t xml:space="preserve">AI assistance disclosure: the project was developed with the help of an AI coding assistant (Claude) under the course rules for Module 8, with all decisions reviewed, tested, and understood by the student; assistance is visible in the repository's commit history.</w:t>
+        <w:t xml:space="preserve">Use of AI assistance: in line with the Module 8 rules, I used an AI coding assistant (Claude) for scaffolding, refactoring and documentation support. I reviewed and tested every change, made the modelling and evaluation decisions myself, and can explain and defend each component of this submission.</w:t>
       </w:r>
     </w:p>
     <w:sectPr>

</xml_diff>